<commit_message>
docs: refresh suite for 28-check demo, authoritative 2026 HHS FPL, step-two workflows (redetermine/overpayment/refer_fraud); fold no-space-path, cmd.exe detached-launch, and stop-orphaned-sign-off-executions lessons into the SA runbook + maintenance
</commit_message>
<xml_diff>
--- a/docs/Benefits-AgentCore-Maintenance.docx
+++ b/docs/Benefits-AgentCore-Maintenance.docx
@@ -694,7 +694,7 @@
           <w:sz w:val="17"/>
           <w:szCs w:val="17"/>
         </w:rPr>
-        <w:t xml:space="preserve">bash lib/engine/demo.sh    agents/benefits-eligibility   # smoke test: expect 21/21</w:t>
+        <w:t xml:space="preserve">bash lib/engine/demo.sh    agents/benefits-eligibility   # smoke test: expect 28/28</w:t>
       </w:r>
     </w:p>
     <w:p>
@@ -1641,7 +1641,7 @@
         <w:t xml:space="preserve">bash lib/engine/demo.sh agents/benefits-eligibility</w:t>
       </w:r>
       <w:r>
-        <w:t xml:space="preserve"> is the fastest health check — 21/21 means the whole governed path is intact.</w:t>
+        <w:t xml:space="preserve"> is the fastest health check — 28/28 means the whole governed path is intact.</w:t>
       </w:r>
     </w:p>
     <w:p>
@@ -1988,6 +1988,38 @@
       </w:r>
       <w:r>
         <w:t xml:space="preserve"> (also prune the ECR repo and CodeBuild project).</w:t>
+      </w:r>
+    </w:p>
+    <w:p>
+      <w:pPr>
+        <w:pStyle w:val="ListParagraph"/>
+        <w:numPr>
+          <w:ilvl w:val="0"/>
+          <w:numId w:val="1"/>
+        </w:numPr>
+        <w:spacing w:after="70" w:line="260"/>
+      </w:pPr>
+      <w:r>
+        <w:rPr>
+          <w:b/>
+          <w:bCs/>
+        </w:rPr>
+        <w:t xml:space="preserve">Stop pending sign-off executions first. </w:t>
+      </w:r>
+      <w:r>
+        <w:t xml:space="preserve">If you invoked the agent and left a determination PENDING (never approved), stop that RUNNING Step Functions execution before teardown — otherwise it keeps </w:t>
+      </w:r>
+      <w:r>
+        <w:rPr>
+          <w:rFonts w:ascii="Consolas" w:cs="Consolas" w:eastAsia="Consolas" w:hAnsi="Consolas"/>
+          <w:color w:val="1B3A2B"/>
+          <w:sz w:val="18"/>
+          <w:szCs w:val="18"/>
+        </w:rPr>
+        <w:t xml:space="preserve">ben-signoff</w:t>
+      </w:r>
+      <w:r>
+        <w:t xml:space="preserve"> stuck DELETING and blocks the next deploy (see §7).</w:t>
       </w:r>
     </w:p>
     <w:p>
@@ -2094,7 +2126,7 @@
                 <w:sz w:val="19"/>
                 <w:szCs w:val="19"/>
               </w:rPr>
-              <w:t xml:space="preserve">ConflictException on the policy engine at deploy</w:t>
+              <w:t xml:space="preserve">Deploy fails: StateMachineDeleting on ben-signoff</w:t>
             </w:r>
           </w:p>
         </w:tc>
@@ -2118,7 +2150,7 @@
                 <w:sz w:val="19"/>
                 <w:szCs w:val="19"/>
               </w:rPr>
-              <w:t xml:space="preserve">Two spine deploys overlapped. Run serialized; a fresh destroy → deploy clears it.</w:t>
+              <w:t xml:space="preserve">A prior invoke left a waitForTaskToken sign-off execution RUNNING (a PENDING determination that was never approved). It keeps the ben-signoff state machine stuck DELETING, which blocks re-creating one of the same name. Stop the leftover execution (list-executions --status-filter RUNNING → stop-execution), let deletion finish, then redeploy. Stop pending sign-off executions BEFORE teardown to avoid this.</w:t>
             </w:r>
           </w:p>
         </w:tc>
@@ -2144,7 +2176,7 @@
                 <w:sz w:val="19"/>
                 <w:szCs w:val="19"/>
               </w:rPr>
-              <w:t xml:space="preserve">Control Lambda hits the wrong table/bucket (AccessDenied on audit)</w:t>
+              <w:t xml:space="preserve">Git-Bash 'cd: …/eligibility: No such file or directory' (Windows)</w:t>
             </w:r>
           </w:p>
         </w:tc>
@@ -2168,7 +2200,7 @@
                 <w:sz w:val="19"/>
                 <w:szCs w:val="19"/>
               </w:rPr>
-              <w:t xml:space="preserve">The control's resource env wasn't wired. The engine's wire_env step sets AUDIT_TABLE / AUDIT_BUCKET / PENDING_TABLE / SM_NAME on every control + sign-off Lambda; a full deploy re-applies it.</w:t>
+              <w:t xml:space="preserve">The project path contains a space and PowerShell mangled the quoting. Deploy from a no-space path (e.g. benefits_eligibility_agent).</w:t>
             </w:r>
           </w:p>
         </w:tc>
@@ -2194,7 +2226,7 @@
                 <w:sz w:val="19"/>
                 <w:szCs w:val="19"/>
               </w:rPr>
-              <w:t xml:space="preserve">render.py FileNotFoundError on manifest.yaml (Windows)</w:t>
+              <w:t xml:space="preserve">Detached deploy/launch produces no log (Windows)</w:t>
             </w:r>
           </w:p>
         </w:tc>
@@ -2218,7 +2250,7 @@
                 <w:sz w:val="19"/>
                 <w:szCs w:val="19"/>
               </w:rPr>
-              <w:t xml:space="preserve">A helper changed directory before resolving the relative agent path. The helpers resolve the agent dir to an absolute path before cd; run them from the project root.</w:t>
+              <w:t xml:space="preserve">Start-Process bash.exe doesn't launch reliably. Wrap it in cmd.exe: Start-Process cmd.exe /c '"…bash.exe" -l runner.sh &gt; x.log 2&gt;&amp;1' -WorkingDirectory &lt;dir&gt;.</w:t>
             </w:r>
           </w:p>
         </w:tc>
@@ -2244,7 +2276,7 @@
                 <w:sz w:val="19"/>
                 <w:szCs w:val="19"/>
               </w:rPr>
-              <w:t xml:space="preserve">Runtime invoke returns 424 / gateway not found</w:t>
+              <w:t xml:space="preserve">ConflictException on the policy engine at deploy</w:t>
             </w:r>
           </w:p>
         </w:tc>
@@ -2268,7 +2300,7 @@
                 <w:sz w:val="19"/>
                 <w:szCs w:val="19"/>
               </w:rPr>
-              <w:t xml:space="preserve">SSM parameter missing or stale. Confirm /ben-eligibility/gateway-url exists and matches the live gateway; the deploy sets MSYS_NO_PATHCONV=1 so the name isn't mangled on Windows.</w:t>
+              <w:t xml:space="preserve">Two spine deploys overlapped. Run serialized; a fresh destroy → deploy clears it.</w:t>
             </w:r>
           </w:p>
         </w:tc>
@@ -2294,7 +2326,7 @@
                 <w:sz w:val="19"/>
                 <w:szCs w:val="19"/>
               </w:rPr>
-              <w:t xml:space="preserve">'draft failed: ValidationException ... temperature and top_p'</w:t>
+              <w:t xml:space="preserve">Control Lambda hits the wrong table/bucket (AccessDenied on audit)</w:t>
             </w:r>
           </w:p>
         </w:tc>
@@ -2318,7 +2350,7 @@
                 <w:sz w:val="19"/>
                 <w:szCs w:val="19"/>
               </w:rPr>
-              <w:t xml:space="preserve">The model rejects both parameters together via Converse. Send temperature only.</w:t>
+              <w:t xml:space="preserve">The control's resource env wasn't wired. The engine's wire_env step sets AUDIT_TABLE / AUDIT_BUCKET / PENDING_TABLE / SM_NAME on every control + sign-off Lambda; a full deploy re-applies it.</w:t>
             </w:r>
           </w:p>
         </w:tc>
@@ -2344,7 +2376,7 @@
                 <w:sz w:val="19"/>
                 <w:szCs w:val="19"/>
               </w:rPr>
-              <w:t xml:space="preserve">agentcore configure/launch crashes with a Unicode or console error</w:t>
+              <w:t xml:space="preserve">render.py FileNotFoundError on manifest.yaml (Windows)</w:t>
             </w:r>
           </w:p>
         </w:tc>
@@ -2368,7 +2400,7 @@
                 <w:sz w:val="19"/>
                 <w:szCs w:val="19"/>
               </w:rPr>
-              <w:t xml:space="preserve">Windows codepage. Export PYTHONIOENCODING=utf-8, PYTHONUTF8=1, AGENTCORE_SUPPRESS_RECOMMENDATION=1 (set in the helper scripts).</w:t>
+              <w:t xml:space="preserve">A helper changed directory before resolving the relative agent path. The helpers resolve the agent dir to an absolute path before cd; run them from the project root.</w:t>
             </w:r>
           </w:p>
         </w:tc>
@@ -2394,7 +2426,7 @@
                 <w:sz w:val="19"/>
                 <w:szCs w:val="19"/>
               </w:rPr>
-              <w:t xml:space="preserve">'Invalid version id' during bucket teardown</w:t>
+              <w:t xml:space="preserve">Runtime invoke returns 424 / gateway not found</w:t>
             </w:r>
           </w:p>
         </w:tc>
@@ -2418,7 +2450,7 @@
                 <w:sz w:val="19"/>
                 <w:szCs w:val="19"/>
               </w:rPr>
-              <w:t xml:space="preserve">Git-Bash trailing \r on the version id. Pipe list output through tr -d '\r' (handled in destroy.sh).</w:t>
+              <w:t xml:space="preserve">SSM parameter missing or stale. Confirm /ben-eligibility/gateway-url exists and matches the live gateway; the deploy sets MSYS_NO_PATHCONV=1 so the name isn't mangled on Windows.</w:t>
             </w:r>
           </w:p>
         </w:tc>
@@ -2444,7 +2476,7 @@
                 <w:sz w:val="19"/>
                 <w:szCs w:val="19"/>
               </w:rPr>
-              <w:t xml:space="preserve">demo shows a tool ALLOW but no result field</w:t>
+              <w:t xml:space="preserve">'draft failed: ValidationException ... temperature and top_p'</w:t>
             </w:r>
           </w:p>
         </w:tc>
@@ -2452,6 +2484,156 @@
           <w:tcPr>
             <w:tcW w:type="dxa" w:w="7340"/>
             <w:shd w:fill="F4F8FA" w:val="clear"/>
+            <w:tcMar>
+              <w:top w:type="dxa" w:w="60"/>
+              <w:left w:type="dxa" w:w="110"/>
+              <w:bottom w:type="dxa" w:w="60"/>
+              <w:right w:type="dxa" w:w="110"/>
+            </w:tcMar>
+          </w:tcPr>
+          <w:p>
+            <w:pPr>
+              <w:spacing w:after="0" w:line="250"/>
+            </w:pPr>
+            <w:r>
+              <w:rPr>
+                <w:sz w:val="19"/>
+                <w:szCs w:val="19"/>
+              </w:rPr>
+              <w:t xml:space="preserve">The model rejects both parameters together via Converse. Send temperature only.</w:t>
+            </w:r>
+          </w:p>
+        </w:tc>
+      </w:tr>
+      <w:tr>
+        <w:tc>
+          <w:tcPr>
+            <w:tcW w:type="dxa" w:w="3100"/>
+            <w:shd w:fill="FFFFFF" w:val="clear"/>
+            <w:tcMar>
+              <w:top w:type="dxa" w:w="60"/>
+              <w:left w:type="dxa" w:w="110"/>
+              <w:bottom w:type="dxa" w:w="60"/>
+              <w:right w:type="dxa" w:w="110"/>
+            </w:tcMar>
+          </w:tcPr>
+          <w:p>
+            <w:pPr>
+              <w:spacing w:after="0" w:line="250"/>
+            </w:pPr>
+            <w:r>
+              <w:rPr>
+                <w:sz w:val="19"/>
+                <w:szCs w:val="19"/>
+              </w:rPr>
+              <w:t xml:space="preserve">agentcore configure/launch crashes with a Unicode or console error</w:t>
+            </w:r>
+          </w:p>
+        </w:tc>
+        <w:tc>
+          <w:tcPr>
+            <w:tcW w:type="dxa" w:w="7340"/>
+            <w:shd w:fill="FFFFFF" w:val="clear"/>
+            <w:tcMar>
+              <w:top w:type="dxa" w:w="60"/>
+              <w:left w:type="dxa" w:w="110"/>
+              <w:bottom w:type="dxa" w:w="60"/>
+              <w:right w:type="dxa" w:w="110"/>
+            </w:tcMar>
+          </w:tcPr>
+          <w:p>
+            <w:pPr>
+              <w:spacing w:after="0" w:line="250"/>
+            </w:pPr>
+            <w:r>
+              <w:rPr>
+                <w:sz w:val="19"/>
+                <w:szCs w:val="19"/>
+              </w:rPr>
+              <w:t xml:space="preserve">Windows codepage. Export PYTHONIOENCODING=utf-8, PYTHONUTF8=1, AGENTCORE_SUPPRESS_RECOMMENDATION=1 (set in the helper scripts).</w:t>
+            </w:r>
+          </w:p>
+        </w:tc>
+      </w:tr>
+      <w:tr>
+        <w:tc>
+          <w:tcPr>
+            <w:tcW w:type="dxa" w:w="3100"/>
+            <w:shd w:fill="F4F8FA" w:val="clear"/>
+            <w:tcMar>
+              <w:top w:type="dxa" w:w="60"/>
+              <w:left w:type="dxa" w:w="110"/>
+              <w:bottom w:type="dxa" w:w="60"/>
+              <w:right w:type="dxa" w:w="110"/>
+            </w:tcMar>
+          </w:tcPr>
+          <w:p>
+            <w:pPr>
+              <w:spacing w:after="0" w:line="250"/>
+            </w:pPr>
+            <w:r>
+              <w:rPr>
+                <w:sz w:val="19"/>
+                <w:szCs w:val="19"/>
+              </w:rPr>
+              <w:t xml:space="preserve">'Invalid version id' during bucket teardown</w:t>
+            </w:r>
+          </w:p>
+        </w:tc>
+        <w:tc>
+          <w:tcPr>
+            <w:tcW w:type="dxa" w:w="7340"/>
+            <w:shd w:fill="F4F8FA" w:val="clear"/>
+            <w:tcMar>
+              <w:top w:type="dxa" w:w="60"/>
+              <w:left w:type="dxa" w:w="110"/>
+              <w:bottom w:type="dxa" w:w="60"/>
+              <w:right w:type="dxa" w:w="110"/>
+            </w:tcMar>
+          </w:tcPr>
+          <w:p>
+            <w:pPr>
+              <w:spacing w:after="0" w:line="250"/>
+            </w:pPr>
+            <w:r>
+              <w:rPr>
+                <w:sz w:val="19"/>
+                <w:szCs w:val="19"/>
+              </w:rPr>
+              <w:t xml:space="preserve">Git-Bash trailing \r on the version id. Pipe list output through tr -d '\r' (handled in destroy.sh).</w:t>
+            </w:r>
+          </w:p>
+        </w:tc>
+      </w:tr>
+      <w:tr>
+        <w:tc>
+          <w:tcPr>
+            <w:tcW w:type="dxa" w:w="3100"/>
+            <w:shd w:fill="FFFFFF" w:val="clear"/>
+            <w:tcMar>
+              <w:top w:type="dxa" w:w="60"/>
+              <w:left w:type="dxa" w:w="110"/>
+              <w:bottom w:type="dxa" w:w="60"/>
+              <w:right w:type="dxa" w:w="110"/>
+            </w:tcMar>
+          </w:tcPr>
+          <w:p>
+            <w:pPr>
+              <w:spacing w:after="0" w:line="250"/>
+            </w:pPr>
+            <w:r>
+              <w:rPr>
+                <w:sz w:val="19"/>
+                <w:szCs w:val="19"/>
+              </w:rPr>
+              <w:t xml:space="preserve">demo shows a tool ALLOW but no result field</w:t>
+            </w:r>
+          </w:p>
+        </w:tc>
+        <w:tc>
+          <w:tcPr>
+            <w:tcW w:type="dxa" w:w="7340"/>
+            <w:shd w:fill="FFFFFF" w:val="clear"/>
             <w:tcMar>
               <w:top w:type="dxa" w:w="60"/>
               <w:left w:type="dxa" w:w="110"/>

</xml_diff>

<commit_message>
fix(sign-off) + docs: request_signoff takes validated access_token (P0-5 parity); correct live count to 29/29
Benefits manifest still required 'requester'; live ENFORCE demo failed until fixed, now passes 29/29.
Updated decks/guides/README to the verified 29/29, fixed a stale 'four more checks than PV' note,
and regenerated the .pptx/.docx.
</commit_message>
<xml_diff>
--- a/docs/Benefits-AgentCore-Maintenance.docx
+++ b/docs/Benefits-AgentCore-Maintenance.docx
@@ -694,7 +694,7 @@
           <w:sz w:val="17"/>
           <w:szCs w:val="17"/>
         </w:rPr>
-        <w:t xml:space="preserve">bash lib/engine/demo.sh    agents/benefits-eligibility   # smoke test: expect 28/28</w:t>
+        <w:t xml:space="preserve">bash lib/engine/demo.sh    agents/benefits-eligibility   # smoke test: expect 29/29</w:t>
       </w:r>
     </w:p>
     <w:p>
@@ -1641,7 +1641,7 @@
         <w:t xml:space="preserve">bash lib/engine/demo.sh agents/benefits-eligibility</w:t>
       </w:r>
       <w:r>
-        <w:t xml:space="preserve"> is the fastest health check — 28/28 means the whole governed path is intact.</w:t>
+        <w:t xml:space="preserve"> is the fastest health check — 29/29 means the whole governed path is intact.</w:t>
       </w:r>
     </w:p>
     <w:p>

</xml_diff>